<commit_message>
Foreground alignment research and update CV with portfolio link
</commit_message>
<xml_diff>
--- a/files/anh-minh-hoang-cv.docx
+++ b/files/anh-minh-hoang-cv.docx
@@ -24,7 +24,7 @@
           <w:color w:val="000000"/>
           <w:sz w:val="38"/>
         </w:rPr>
-        <w:t>Anh Minh (Eric) Hoang</w:t>
+        <w:t>Anh-Minh Hoang (Eric)</w:t>
       </w:r>
     </w:p>
     <w:p>
@@ -43,13 +43,19 @@
       <w:r>
         <w:rPr>
           <w:rFonts w:ascii="Times New Roman" w:hAnsi="Times New Roman"/>
-          <w:b w:val="0"/>
-          <w:i w:val="0"/>
-          <w:color w:val="000000"/>
-          <w:sz w:val="22"/>
-        </w:rPr>
-        <w:t>23minh.ha@vinuni.edu.vn  |  Hanoi, Vietnam</w:t>
-      </w:r>
+          <w:sz w:val="22"/>
+        </w:rPr>
+        <w:t xml:space="preserve">23minh.ha@vinuni.edu.vn  |  Hanoi, Vietnam  |  </w:t>
+      </w:r>
+      <w:hyperlink r:id="rId14">
+        <w:r>
+          <w:rPr>
+            <w:rFonts w:ascii="Times New Roman" w:hAnsi="Times New Roman"/>
+            <w:sz w:val="22"/>
+          </w:rPr>
+          <w:t>amhoangwork-oss.github.io/erichoang/</w:t>
+        </w:r>
+      </w:hyperlink>
     </w:p>
     <w:p>
       <w:pPr>
@@ -72,7 +78,7 @@
           <w:color w:val="000000"/>
           <w:sz w:val="22"/>
         </w:rPr>
-        <w:t>Research in LLM safety and alignment, focused on detecting attempts to bypass safeguards and understanding how compromised training data changes model behavior.</w:t>
+        <w:t>AI alignment research focused on model representations, self-critique, and reliable safeguards for increasingly capable language models.</w:t>
       </w:r>
     </w:p>
     <w:p>
@@ -81,7 +87,7 @@
         <w:keepNext/>
         <w:keepLines/>
         <w:widowControl/>
-        <w:spacing w:before="160" w:after="80" w:line="240" w:lineRule="auto"/>
+        <w:spacing w:before="120" w:after="80" w:line="240" w:lineRule="auto"/>
         <w:ind w:left="0" w:right="0" w:firstLine="0"/>
         <w:jc w:val="center"/>
         <w:rPr>
@@ -96,7 +102,7 @@
           <w:color w:val="000000"/>
           <w:sz w:val="22"/>
         </w:rPr>
-        <w:t>Research Manuscripts</w:t>
+        <w:t>Current Research</w:t>
       </w:r>
     </w:p>
     <w:p>
@@ -119,31 +125,7 @@
           <w:color w:val="000000"/>
           <w:sz w:val="22"/>
         </w:rPr>
-        <w:t>SafePrompt: Jailbreak Search Defense through Activation Signatures</w:t>
-      </w:r>
-    </w:p>
-    <w:p>
-      <w:pPr>
-        <w:pStyle w:val="BodyText"/>
-        <w:keepNext/>
-        <w:keepLines/>
-        <w:widowControl/>
-        <w:spacing w:line="240" w:lineRule="auto" w:before="0" w:after="60"/>
-        <w:ind w:left="0" w:right="0" w:firstLine="0"/>
-        <w:jc w:val="left"/>
-        <w:rPr>
-          <w:rFonts w:ascii="Calibri" w:hAnsi="Calibri" w:cs="Calibri"/>
-        </w:rPr>
-      </w:pPr>
-      <w:r>
-        <w:rPr>
-          <w:rFonts w:ascii="Times New Roman" w:hAnsi="Times New Roman"/>
-          <w:b w:val="0"/>
-          <w:i w:val="0"/>
-          <w:color w:val="000000"/>
-          <w:sz w:val="21"/>
-        </w:rPr>
-        <w:t>Anh Minh Hoang | 2026 | ACL ARR, October 2026 cycle · Under review</w:t>
+        <w:t>Constitutional self-alignment | Work in progress</w:t>
       </w:r>
     </w:p>
     <w:p>
@@ -171,7 +153,78 @@
           <w:color w:val="000000"/>
           <w:sz w:val="22"/>
         </w:rPr>
-        <w:t>Designed a filter that detects attempts to bypass a language model’s safety rules by examining patterns in a separate model’s internal activity.</w:t>
+        <w:t>Investigating whether self-critique and on-policy distillation can improve adherence to explicit principles with minimal supervised or RLHF intervention.</w:t>
+      </w:r>
+    </w:p>
+    <w:p>
+      <w:pPr>
+        <w:pStyle w:val="Heading1"/>
+        <w:keepNext/>
+        <w:keepLines/>
+        <w:widowControl/>
+        <w:spacing w:before="120" w:after="80" w:line="240" w:lineRule="auto"/>
+        <w:ind w:left="0" w:right="0" w:firstLine="0"/>
+        <w:jc w:val="center"/>
+        <w:rPr>
+          <w:rFonts w:ascii="Calibri" w:hAnsi="Calibri" w:cs="Calibri"/>
+        </w:rPr>
+      </w:pPr>
+      <w:r>
+        <w:rPr>
+          <w:rFonts w:ascii="Times New Roman" w:hAnsi="Times New Roman"/>
+          <w:b/>
+          <w:i w:val="0"/>
+          <w:color w:val="000000"/>
+          <w:sz w:val="22"/>
+        </w:rPr>
+        <w:t>Research Manuscripts</w:t>
+      </w:r>
+    </w:p>
+    <w:p>
+      <w:pPr>
+        <w:keepNext/>
+        <w:keepLines/>
+        <w:widowControl/>
+        <w:spacing w:before="100" w:after="40" w:line="240" w:lineRule="auto"/>
+        <w:ind w:left="0" w:right="0" w:firstLine="0"/>
+        <w:jc w:val="left"/>
+        <w:rPr>
+          <w:rFonts w:ascii="Calibri" w:hAnsi="Calibri" w:cs="Calibri"/>
+        </w:rPr>
+      </w:pPr>
+      <w:r>
+        <w:rPr>
+          <w:rFonts w:ascii="Times New Roman" w:hAnsi="Times New Roman"/>
+          <w:b/>
+          <w:i w:val="0"/>
+          <w:color w:val="000000"/>
+          <w:sz w:val="22"/>
+        </w:rPr>
+        <w:t>Latent-Target Poisoning: Discovering Attack Populations in Coding Assistants</w:t>
+      </w:r>
+    </w:p>
+    <w:p>
+      <w:pPr>
+        <w:pStyle w:val="BodyText"/>
+        <w:keepNext/>
+        <w:keepLines/>
+        <w:widowControl/>
+        <w:spacing w:line="240" w:lineRule="auto" w:before="0" w:after="60"/>
+        <w:ind w:left="0" w:right="0" w:firstLine="0"/>
+        <w:jc w:val="left"/>
+        <w:rPr>
+          <w:rFonts w:ascii="Calibri" w:hAnsi="Calibri" w:cs="Calibri"/>
+        </w:rPr>
+      </w:pPr>
+      <w:r>
+        <w:rPr>
+          <w:rFonts w:ascii="Times New Roman" w:hAnsi="Times New Roman"/>
+          <w:b w:val="0"/>
+          <w:i w:val="0"/>
+          <w:color w:val="000000"/>
+          <w:sz w:val="21"/>
+        </w:rPr>
+        <w:t>Anh Minh Hoang | 2026 | ACL ARR, October 2026 cycle · Under review</w:t>
       </w:r>
     </w:p>
     <w:p>
@@ -199,54 +252,7 @@
           <w:color w:val="000000"/>
           <w:sz w:val="22"/>
         </w:rPr>
-        <w:t>Across two models, reduced the success of an automated attack from 91–92% to 14–17% after 90 attempts per goal; blocked 2.53% of 750 legitimate requests. Evaluated repeated attacks, attacker feedback, and the cost of rejecting valid requests.</w:t>
-      </w:r>
-    </w:p>
-    <w:p>
-      <w:pPr>
-        <w:keepNext/>
-        <w:keepLines/>
-        <w:widowControl/>
-        <w:spacing w:before="100" w:after="40" w:line="240" w:lineRule="auto"/>
-        <w:ind w:left="0" w:right="0" w:firstLine="0"/>
-        <w:jc w:val="left"/>
-        <w:rPr>
-          <w:rFonts w:ascii="Calibri" w:hAnsi="Calibri" w:cs="Calibri"/>
-        </w:rPr>
-      </w:pPr>
-      <w:r>
-        <w:rPr>
-          <w:rFonts w:ascii="Times New Roman" w:hAnsi="Times New Roman"/>
-          <w:b/>
-          <w:i w:val="0"/>
-          <w:color w:val="000000"/>
-          <w:sz w:val="22"/>
-        </w:rPr>
-        <w:t>Latent-Target Poisoning: Discovering Attack Populations in Coding Assistants</w:t>
-      </w:r>
-    </w:p>
-    <w:p>
-      <w:pPr>
-        <w:pStyle w:val="BodyText"/>
-        <w:keepNext/>
-        <w:keepLines/>
-        <w:widowControl/>
-        <w:spacing w:line="240" w:lineRule="auto" w:before="0" w:after="60"/>
-        <w:ind w:left="0" w:right="0" w:firstLine="0"/>
-        <w:jc w:val="left"/>
-        <w:rPr>
-          <w:rFonts w:ascii="Calibri" w:hAnsi="Calibri" w:cs="Calibri"/>
-        </w:rPr>
-      </w:pPr>
-      <w:r>
-        <w:rPr>
-          <w:rFonts w:ascii="Times New Roman" w:hAnsi="Times New Roman"/>
-          <w:b w:val="0"/>
-          <w:i w:val="0"/>
-          <w:color w:val="000000"/>
-          <w:sz w:val="21"/>
-        </w:rPr>
-        <w:t>Anh Minh Hoang | 2026 | ACL ARR, October 2026 cycle · Under review</w:t>
+        <w:t>Discovered target populations from frozen model representations and poisoned training responses to induce unwanted code on unchanged requests.</w:t>
       </w:r>
     </w:p>
     <w:p>
@@ -274,7 +280,54 @@
           <w:color w:val="000000"/>
           <w:sz w:val="22"/>
         </w:rPr>
-        <w:t>Investigated how tampered training examples can teach coding assistants to insert unwanted code into answers to ordinary requests, without adding a trigger to the user’s prompt.</w:t>
+        <w:t>Compared four population selectors across two model families and two datasets, measuring target emission, spillover, and coding functionality.</w:t>
+      </w:r>
+    </w:p>
+    <w:p>
+      <w:pPr>
+        <w:keepNext/>
+        <w:keepLines/>
+        <w:widowControl/>
+        <w:spacing w:before="100" w:after="40" w:line="240" w:lineRule="auto"/>
+        <w:ind w:left="0" w:right="0" w:firstLine="0"/>
+        <w:jc w:val="left"/>
+        <w:rPr>
+          <w:rFonts w:ascii="Calibri" w:hAnsi="Calibri" w:cs="Calibri"/>
+        </w:rPr>
+      </w:pPr>
+      <w:r>
+        <w:rPr>
+          <w:rFonts w:ascii="Times New Roman" w:hAnsi="Times New Roman"/>
+          <w:b/>
+          <w:i w:val="0"/>
+          <w:color w:val="000000"/>
+          <w:sz w:val="22"/>
+        </w:rPr>
+        <w:t>SafePrompt: Jailbreak Search Defense through Activation Signatures</w:t>
+      </w:r>
+    </w:p>
+    <w:p>
+      <w:pPr>
+        <w:pStyle w:val="BodyText"/>
+        <w:keepNext/>
+        <w:keepLines/>
+        <w:widowControl/>
+        <w:spacing w:line="240" w:lineRule="auto" w:before="0" w:after="60"/>
+        <w:ind w:left="0" w:right="0" w:firstLine="0"/>
+        <w:jc w:val="left"/>
+        <w:rPr>
+          <w:rFonts w:ascii="Calibri" w:hAnsi="Calibri" w:cs="Calibri"/>
+        </w:rPr>
+      </w:pPr>
+      <w:r>
+        <w:rPr>
+          <w:rFonts w:ascii="Times New Roman" w:hAnsi="Times New Roman"/>
+          <w:b w:val="0"/>
+          <w:i w:val="0"/>
+          <w:color w:val="000000"/>
+          <w:sz w:val="21"/>
+        </w:rPr>
+        <w:t>Anh Minh Hoang | 2026 | ACL ARR, October 2026 cycle · Under review</w:t>
       </w:r>
     </w:p>
     <w:p>
@@ -302,54 +355,7 @@
           <w:color w:val="000000"/>
           <w:sz w:val="22"/>
         </w:rPr>
-        <w:t>Built controlled experiments across two model families and two coding datasets, comparing four ways of selecting affected requests. Measured unwanted-code generation, effects on other requests, and performance on standard coding tasks.</w:t>
-      </w:r>
-    </w:p>
-    <w:p>
-      <w:pPr>
-        <w:keepNext/>
-        <w:keepLines/>
-        <w:widowControl/>
-        <w:spacing w:before="100" w:after="40" w:line="240" w:lineRule="auto"/>
-        <w:ind w:left="0" w:right="0" w:firstLine="0"/>
-        <w:jc w:val="left"/>
-        <w:rPr>
-          <w:rFonts w:ascii="Calibri" w:hAnsi="Calibri" w:cs="Calibri"/>
-        </w:rPr>
-      </w:pPr>
-      <w:r>
-        <w:rPr>
-          <w:rFonts w:ascii="Times New Roman" w:hAnsi="Times New Roman"/>
-          <w:b/>
-          <w:i w:val="0"/>
-          <w:color w:val="000000"/>
-          <w:sz w:val="22"/>
-        </w:rPr>
-        <w:t>CSR: Physically conditioned scale-transfer super-resolution across optical missions</w:t>
-      </w:r>
-    </w:p>
-    <w:p>
-      <w:pPr>
-        <w:pStyle w:val="BodyText"/>
-        <w:keepNext/>
-        <w:keepLines/>
-        <w:widowControl/>
-        <w:spacing w:line="240" w:lineRule="auto" w:before="0" w:after="60"/>
-        <w:ind w:left="0" w:right="0" w:firstLine="0"/>
-        <w:jc w:val="left"/>
-        <w:rPr>
-          <w:rFonts w:ascii="Calibri" w:hAnsi="Calibri" w:cs="Calibri"/>
-        </w:rPr>
-      </w:pPr>
-      <w:r>
-        <w:rPr>
-          <w:rFonts w:ascii="Times New Roman" w:hAnsi="Times New Roman"/>
-          <w:b w:val="0"/>
-          <w:i w:val="0"/>
-          <w:color w:val="000000"/>
-          <w:sz w:val="21"/>
-        </w:rPr>
-        <w:t>Minh A. Hoang and Nidal Kamel | 2026 | Under review at ISPRS Journal of Photogrammetry and Remote Sensing</w:t>
+        <w:t>Developed an activation-based filter for jailbreak search that passes accepted requests unchanged to a separate language model.</w:t>
       </w:r>
     </w:p>
     <w:p>
@@ -377,7 +383,54 @@
           <w:color w:val="000000"/>
           <w:sz w:val="22"/>
         </w:rPr>
-        <w:t>Developed a model that improves the spatial detail of satellite images from different sensors, using wavelength and pixel-size information instead of a separate model for each sensor.</w:t>
+        <w:t>Across two models, reduced PAIR attack success from 91–92% to 14–17% at 90 queries per goal, rejecting 2.53% of 750 legitimate requests; evaluated adaptive search and sensitive-topic utility.</w:t>
+      </w:r>
+    </w:p>
+    <w:p>
+      <w:pPr>
+        <w:keepNext/>
+        <w:keepLines/>
+        <w:widowControl/>
+        <w:spacing w:before="100" w:after="40" w:line="240" w:lineRule="auto"/>
+        <w:ind w:left="0" w:right="0" w:firstLine="0"/>
+        <w:jc w:val="left"/>
+        <w:rPr>
+          <w:rFonts w:ascii="Calibri" w:hAnsi="Calibri" w:cs="Calibri"/>
+        </w:rPr>
+      </w:pPr>
+      <w:r>
+        <w:rPr>
+          <w:rFonts w:ascii="Times New Roman" w:hAnsi="Times New Roman"/>
+          <w:b/>
+          <w:i w:val="0"/>
+          <w:color w:val="000000"/>
+          <w:sz w:val="22"/>
+        </w:rPr>
+        <w:t>CSR: Physically conditioned scale-transfer super-resolution across optical missions</w:t>
+      </w:r>
+    </w:p>
+    <w:p>
+      <w:pPr>
+        <w:pStyle w:val="BodyText"/>
+        <w:keepNext/>
+        <w:keepLines/>
+        <w:widowControl/>
+        <w:spacing w:line="240" w:lineRule="auto" w:before="0" w:after="60"/>
+        <w:ind w:left="0" w:right="0" w:firstLine="0"/>
+        <w:jc w:val="left"/>
+        <w:rPr>
+          <w:rFonts w:ascii="Calibri" w:hAnsi="Calibri" w:cs="Calibri"/>
+        </w:rPr>
+      </w:pPr>
+      <w:r>
+        <w:rPr>
+          <w:rFonts w:ascii="Times New Roman" w:hAnsi="Times New Roman"/>
+          <w:b w:val="0"/>
+          <w:i w:val="0"/>
+          <w:color w:val="000000"/>
+          <w:sz w:val="21"/>
+        </w:rPr>
+        <w:t>Minh A. Hoang and Nidal Kamel | 2026 | Under review at ISPRS Journal of Photogrammetry and Remote Sensing</w:t>
       </w:r>
     </w:p>
     <w:p>
@@ -405,82 +458,7 @@
           <w:color w:val="000000"/>
           <w:sz w:val="22"/>
         </w:rPr>
-        <w:t>Achieved the largest mean structural improvement among compared methods on all four 4× OpenSR benchmark suites. Tested adaptation to new satellite data, including 174 held-out PROBA-V scenes.</w:t>
-      </w:r>
-    </w:p>
-    <w:p>
-      <w:pPr>
-        <w:pStyle w:val="Heading1"/>
-        <w:keepNext/>
-        <w:keepLines/>
-        <w:widowControl/>
-        <w:spacing w:before="160" w:after="80" w:line="240" w:lineRule="auto"/>
-        <w:ind w:left="0" w:right="0" w:firstLine="0"/>
-        <w:jc w:val="center"/>
-        <w:rPr>
-          <w:rFonts w:ascii="Calibri" w:hAnsi="Calibri" w:cs="Calibri"/>
-        </w:rPr>
-      </w:pPr>
-      <w:r>
-        <w:rPr>
-          <w:rFonts w:ascii="Times New Roman" w:hAnsi="Times New Roman"/>
-          <w:b/>
-          <w:i w:val="0"/>
-          <w:color w:val="000000"/>
-          <w:sz w:val="22"/>
-        </w:rPr>
-        <w:t>Research Experience</w:t>
-      </w:r>
-    </w:p>
-    <w:p>
-      <w:pPr>
-        <w:keepNext/>
-        <w:keepLines/>
-        <w:widowControl/>
-        <w:spacing w:before="100" w:after="40" w:line="240" w:lineRule="auto"/>
-        <w:ind w:left="0" w:right="0" w:firstLine="0"/>
-        <w:jc w:val="left"/>
-        <w:rPr>
-          <w:rFonts w:ascii="Calibri" w:hAnsi="Calibri" w:cs="Calibri"/>
-        </w:rPr>
-      </w:pPr>
-      <w:r>
-        <w:rPr>
-          <w:rFonts w:ascii="Times New Roman" w:hAnsi="Times New Roman"/>
-          <w:b/>
-          <w:i w:val="0"/>
-          <w:color w:val="000000"/>
-          <w:sz w:val="22"/>
-        </w:rPr>
-        <w:t>Center for Environmental Intelligence, VinUniversity</w:t>
-      </w:r>
-    </w:p>
-    <w:p>
-      <w:pPr>
-        <w:keepNext/>
-        <w:keepLines/>
-        <w:widowControl/>
-        <w:tabs>
-          <w:tab w:pos="10368" w:val="right"/>
-        </w:tabs>
-        <w:spacing w:before="0" w:line="240" w:lineRule="auto" w:after="60"/>
-        <w:ind w:left="0" w:right="0" w:firstLine="0"/>
-        <w:jc w:val="left"/>
-        <w:rPr>
-          <w:rFonts w:ascii="Calibri" w:hAnsi="Calibri" w:cs="Calibri"/>
-        </w:rPr>
-      </w:pPr>
-      <w:r>
-        <w:rPr>
-          <w:rFonts w:ascii="Times New Roman" w:hAnsi="Times New Roman"/>
-          <w:b w:val="0"/>
-          <w:i/>
-          <w:color w:val="000000"/>
-          <w:sz w:val="22"/>
-        </w:rPr>
-        <w:t>Research Assistant</w:t>
-        <w:tab/>
-        <w:t>June 2026 – Present</w:t>
+        <w:t>Developed satellite image reconstruction using wavelength and pixel-size information to transfer across sensors.</w:t>
       </w:r>
     </w:p>
     <w:p>
@@ -508,7 +486,7 @@
           <w:color w:val="000000"/>
           <w:sz w:val="22"/>
         </w:rPr>
-        <w:t>Built satellite-image training and evaluation pipelines in PyTorch Lightning and Hydra for Sentinel-2, Landsat 8/9, NAIP, and VENµS, using data accessed through Planetary Computer STAC.</w:t>
+        <w:t>Achieved the largest mean structural improvement on all four 4× OpenSR benchmark suites; evaluated transfer on 174 held-out PROBA-V scenes.</w:t>
       </w:r>
     </w:p>
     <w:p>
@@ -517,7 +495,110 @@
         <w:keepNext/>
         <w:keepLines/>
         <w:widowControl/>
-        <w:spacing w:before="160" w:after="80" w:line="240" w:lineRule="auto"/>
+        <w:spacing w:before="120" w:after="80" w:line="240" w:lineRule="auto"/>
+        <w:ind w:left="0" w:right="0" w:firstLine="0"/>
+        <w:jc w:val="center"/>
+        <w:rPr>
+          <w:rFonts w:ascii="Calibri" w:hAnsi="Calibri" w:cs="Calibri"/>
+        </w:rPr>
+      </w:pPr>
+      <w:r>
+        <w:rPr>
+          <w:rFonts w:ascii="Times New Roman" w:hAnsi="Times New Roman"/>
+          <w:b/>
+          <w:i w:val="0"/>
+          <w:color w:val="000000"/>
+          <w:sz w:val="22"/>
+        </w:rPr>
+        <w:t>Research Experience</w:t>
+      </w:r>
+    </w:p>
+    <w:p>
+      <w:pPr>
+        <w:keepNext/>
+        <w:keepLines/>
+        <w:widowControl/>
+        <w:spacing w:before="100" w:after="40" w:line="240" w:lineRule="auto"/>
+        <w:ind w:left="0" w:right="0" w:firstLine="0"/>
+        <w:jc w:val="left"/>
+        <w:rPr>
+          <w:rFonts w:ascii="Calibri" w:hAnsi="Calibri" w:cs="Calibri"/>
+        </w:rPr>
+      </w:pPr>
+      <w:r>
+        <w:rPr>
+          <w:rFonts w:ascii="Times New Roman" w:hAnsi="Times New Roman"/>
+          <w:b/>
+          <w:i w:val="0"/>
+          <w:color w:val="000000"/>
+          <w:sz w:val="22"/>
+        </w:rPr>
+        <w:t>Center for Environmental Intelligence, VinUniversity</w:t>
+      </w:r>
+    </w:p>
+    <w:p>
+      <w:pPr>
+        <w:keepNext/>
+        <w:keepLines/>
+        <w:widowControl/>
+        <w:tabs>
+          <w:tab w:pos="10368" w:val="right"/>
+        </w:tabs>
+        <w:spacing w:before="0" w:line="240" w:lineRule="auto" w:after="60"/>
+        <w:ind w:left="0" w:right="0" w:firstLine="0"/>
+        <w:jc w:val="left"/>
+        <w:rPr>
+          <w:rFonts w:ascii="Calibri" w:hAnsi="Calibri" w:cs="Calibri"/>
+        </w:rPr>
+      </w:pPr>
+      <w:r>
+        <w:rPr>
+          <w:rFonts w:ascii="Times New Roman" w:hAnsi="Times New Roman"/>
+          <w:b w:val="0"/>
+          <w:i/>
+          <w:color w:val="000000"/>
+          <w:sz w:val="22"/>
+        </w:rPr>
+        <w:t>Research Assistant</w:t>
+        <w:tab/>
+        <w:t>June 2026 – Present</w:t>
+      </w:r>
+    </w:p>
+    <w:p>
+      <w:pPr>
+        <w:pStyle w:val="ListParagraph"/>
+        <w:keepNext w:val="0"/>
+        <w:keepLines/>
+        <w:widowControl/>
+        <w:numPr>
+          <w:ilvl w:val="0"/>
+          <w:numId w:val="1"/>
+        </w:numPr>
+        <w:spacing w:line="240" w:lineRule="auto" w:before="0" w:after="60"/>
+        <w:ind w:right="0" w:left="216" w:hanging="173"/>
+        <w:jc w:val="left"/>
+        <w:rPr>
+          <w:rFonts w:ascii="Calibri" w:hAnsi="Calibri" w:cs="Calibri"/>
+        </w:rPr>
+      </w:pPr>
+      <w:r>
+        <w:rPr>
+          <w:rFonts w:ascii="Times New Roman" w:hAnsi="Times New Roman"/>
+          <w:b w:val="0"/>
+          <w:i w:val="0"/>
+          <w:color w:val="000000"/>
+          <w:sz w:val="22"/>
+        </w:rPr>
+        <w:t>Built satellite-image training and evaluation pipelines in PyTorch Lightning and Hydra for Sentinel-2, Landsat 8/9, NAIP, and VENµS, using data accessed through Planetary Computer STAC.</w:t>
+      </w:r>
+    </w:p>
+    <w:p>
+      <w:pPr>
+        <w:pStyle w:val="Heading1"/>
+        <w:keepNext/>
+        <w:keepLines/>
+        <w:widowControl/>
+        <w:spacing w:before="120" w:after="80" w:line="240" w:lineRule="auto"/>
         <w:ind w:left="0" w:right="0" w:firstLine="0"/>
         <w:jc w:val="center"/>
         <w:rPr>
@@ -588,7 +669,7 @@
         <w:keepNext/>
         <w:keepLines/>
         <w:widowControl/>
-        <w:spacing w:before="160" w:after="80" w:line="240" w:lineRule="auto"/>
+        <w:spacing w:before="120" w:after="80" w:line="240" w:lineRule="auto"/>
         <w:ind w:left="0" w:right="0" w:firstLine="0"/>
         <w:jc w:val="center"/>
         <w:rPr>
@@ -660,7 +741,7 @@
         <w:keepNext/>
         <w:keepLines/>
         <w:widowControl/>
-        <w:spacing w:before="160" w:after="80" w:line="240" w:lineRule="auto"/>
+        <w:spacing w:before="120" w:after="80" w:line="240" w:lineRule="auto"/>
         <w:ind w:left="0" w:right="0" w:firstLine="0"/>
         <w:jc w:val="center"/>
         <w:rPr>
@@ -699,7 +780,7 @@
           <w:color w:val="000000"/>
           <w:sz w:val="22"/>
         </w:rPr>
-        <w:t>Research: Language-model safety evaluation, model representations, training-data security, controlled experiments.</w:t>
+        <w:t>Research: Alignment, model representations, safety evaluation, training-data poisoning, KL-regularized adaptation.</w:t>
       </w:r>
     </w:p>
     <w:p>
@@ -723,7 +804,7 @@
           <w:color w:val="000000"/>
           <w:sz w:val="22"/>
         </w:rPr>
-        <w:t>Tools: Python, PyTorch, PyTorch Lightning, Hydra, Hugging Face Transformers, LoRA/PEFT.</w:t>
+        <w:t>Tools: Python, PyTorch, Transformers, LoRA/PEFT, vLLM, verl, PyTorch Lightning, Hydra.</w:t>
       </w:r>
     </w:p>
     <w:p>

</xml_diff>

<commit_message>
Simplify CV skills to broad research areas and core tools
</commit_message>
<xml_diff>
--- a/files/anh-minh-hoang-cv.docx
+++ b/files/anh-minh-hoang-cv.docx
@@ -780,7 +780,7 @@
           <w:color w:val="000000"/>
           <w:sz w:val="22"/>
         </w:rPr>
-        <w:t>Research: Alignment, model representations, safety evaluation, training-data poisoning, KL-regularized adaptation.</w:t>
+        <w:t>Research: AI alignment and safety, deep learning, natural language processing, computer vision, experimental design.</w:t>
       </w:r>
     </w:p>
     <w:p>
@@ -804,7 +804,7 @@
           <w:color w:val="000000"/>
           <w:sz w:val="22"/>
         </w:rPr>
-        <w:t>Tools: Python, PyTorch, Transformers, LoRA/PEFT, vLLM, verl, PyTorch Lightning, Hydra.</w:t>
+        <w:t>Tools: Python, PyTorch, Hugging Face Transformers, Linux, Git.</w:t>
       </w:r>
     </w:p>
     <w:p>

</xml_diff>